<commit_message>
task for It project management, updates
</commit_message>
<xml_diff>
--- a/Documents/ITProjectManagement/IT_projectManagement_tasks_2_4.docx
+++ b/Documents/ITProjectManagement/IT_projectManagement_tasks_2_4.docx
@@ -780,6 +780,9 @@
     <w:p>
       <w:pPr>
         <w:spacing w:after="80"/>
+        <w:rPr>
+          <w:lang w:val="ru-RU"/>
+        </w:rPr>
       </w:pPr>
       <w:r>
         <w:rPr>
@@ -805,38 +808,6 @@
         </w:rPr>
         <w:t xml:space="preserve"> и официальным описаниям приложений. </w:t>
       </w:r>
-      <w:proofErr w:type="spellStart"/>
-      <w:r>
-        <w:t>Использованы</w:t>
-      </w:r>
-      <w:proofErr w:type="spellEnd"/>
-      <w:r>
-        <w:t xml:space="preserve"> </w:t>
-      </w:r>
-      <w:proofErr w:type="spellStart"/>
-      <w:r>
-        <w:t>только</w:t>
-      </w:r>
-      <w:proofErr w:type="spellEnd"/>
-      <w:r>
-        <w:t xml:space="preserve"> </w:t>
-      </w:r>
-      <w:proofErr w:type="spellStart"/>
-      <w:r>
-        <w:t>функции</w:t>
-      </w:r>
-      <w:proofErr w:type="spellEnd"/>
-      <w:r>
-        <w:t xml:space="preserve">, </w:t>
-      </w:r>
-      <w:proofErr w:type="spellStart"/>
-      <w:r>
-        <w:t>явно</w:t>
-      </w:r>
-      <w:proofErr w:type="spellEnd"/>
-      <w:r>
-        <w:t xml:space="preserve"> указанные в публичных источниках.</w:t>
-      </w:r>
     </w:p>
     <w:tbl>
       <w:tblPr>
@@ -863,6 +834,7 @@
             <w:vAlign w:val="center"/>
           </w:tcPr>
           <w:p>
+            <w:proofErr w:type="spellStart"/>
             <w:r>
               <w:rPr>
                 <w:b/>
@@ -871,6 +843,7 @@
               </w:rPr>
               <w:t>Конкурент</w:t>
             </w:r>
+            <w:proofErr w:type="spellEnd"/>
           </w:p>
         </w:tc>
         <w:tc>
@@ -2539,6 +2512,7 @@
       <w:pPr>
         <w:spacing w:after="80"/>
         <w:rPr>
+          <w:sz w:val="20"/>
           <w:lang w:val="ru-RU"/>
         </w:rPr>
       </w:pPr>
@@ -2881,10 +2855,9 @@
           <w:p>
             <w:r>
               <w:rPr>
-                <w:b/>
-                <w:sz w:val="13"/>
-              </w:rPr>
-              <w:t>Important</w:t>
+                <w:sz w:val="14"/>
+              </w:rPr>
+              <w:t>—</w:t>
             </w:r>
           </w:p>
         </w:tc>
@@ -3035,7 +3008,7 @@
           <w:p>
             <w:r>
               <w:rPr>
-                <w:sz w:val="13"/>
+                <w:sz w:val="14"/>
               </w:rPr>
               <w:t>Important</w:t>
             </w:r>
@@ -3166,7 +3139,7 @@
           <w:p>
             <w:r>
               <w:rPr>
-                <w:sz w:val="13"/>
+                <w:sz w:val="14"/>
               </w:rPr>
               <w:t>Important</w:t>
             </w:r>
@@ -3297,7 +3270,7 @@
           <w:p>
             <w:r>
               <w:rPr>
-                <w:sz w:val="13"/>
+                <w:sz w:val="14"/>
               </w:rPr>
               <w:t>Important</w:t>
             </w:r>
@@ -3434,9 +3407,9 @@
           <w:p>
             <w:r>
               <w:rPr>
-                <w:sz w:val="13"/>
-              </w:rPr>
-              <w:t>Important</w:t>
+                <w:sz w:val="14"/>
+              </w:rPr>
+              <w:t>—</w:t>
             </w:r>
           </w:p>
         </w:tc>
@@ -3600,10 +3573,9 @@
           <w:p>
             <w:r>
               <w:rPr>
-                <w:b/>
-                <w:sz w:val="13"/>
-              </w:rPr>
-              <w:t>Important</w:t>
+                <w:sz w:val="14"/>
+              </w:rPr>
+              <w:t>—</w:t>
             </w:r>
           </w:p>
         </w:tc>
@@ -3733,9 +3705,9 @@
           <w:p>
             <w:r>
               <w:rPr>
-                <w:sz w:val="13"/>
-              </w:rPr>
-              <w:t>Important</w:t>
+                <w:sz w:val="14"/>
+              </w:rPr>
+              <w:t>Medium</w:t>
             </w:r>
           </w:p>
         </w:tc>
@@ -3864,9 +3836,9 @@
           <w:p>
             <w:r>
               <w:rPr>
-                <w:sz w:val="13"/>
-              </w:rPr>
-              <w:t>Important</w:t>
+                <w:sz w:val="14"/>
+              </w:rPr>
+              <w:t>Medium</w:t>
             </w:r>
           </w:p>
         </w:tc>
@@ -3995,9 +3967,9 @@
           <w:p>
             <w:r>
               <w:rPr>
-                <w:sz w:val="13"/>
-              </w:rPr>
-              <w:t>Important</w:t>
+                <w:sz w:val="14"/>
+              </w:rPr>
+              <w:t>Medium</w:t>
             </w:r>
           </w:p>
         </w:tc>
@@ -4126,9 +4098,9 @@
           <w:p>
             <w:r>
               <w:rPr>
-                <w:sz w:val="13"/>
-              </w:rPr>
-              <w:t>Important</w:t>
+                <w:sz w:val="14"/>
+              </w:rPr>
+              <w:t>—</w:t>
             </w:r>
           </w:p>
         </w:tc>
@@ -4264,10 +4236,9 @@
           <w:p>
             <w:r>
               <w:rPr>
-                <w:b/>
-                <w:sz w:val="13"/>
-              </w:rPr>
-              <w:t>Important</w:t>
+                <w:sz w:val="14"/>
+              </w:rPr>
+              <w:t>—</w:t>
             </w:r>
           </w:p>
         </w:tc>
@@ -4403,9 +4374,9 @@
           <w:p>
             <w:r>
               <w:rPr>
-                <w:sz w:val="13"/>
-              </w:rPr>
-              <w:t>Important</w:t>
+                <w:sz w:val="14"/>
+              </w:rPr>
+              <w:t>Medium</w:t>
             </w:r>
           </w:p>
         </w:tc>
@@ -4540,7 +4511,7 @@
           <w:p>
             <w:r>
               <w:rPr>
-                <w:sz w:val="13"/>
+                <w:sz w:val="14"/>
               </w:rPr>
               <w:t>Important</w:t>
             </w:r>
@@ -4671,9 +4642,9 @@
           <w:p>
             <w:r>
               <w:rPr>
-                <w:sz w:val="13"/>
-              </w:rPr>
-              <w:t>Important</w:t>
+                <w:sz w:val="14"/>
+              </w:rPr>
+              <w:t>Medium</w:t>
             </w:r>
           </w:p>
         </w:tc>
@@ -4707,6 +4678,7 @@
                 <w:b/>
                 <w:sz w:val="13"/>
               </w:rPr>
+              <w:lastRenderedPageBreak/>
               <w:t>4</w:t>
             </w:r>
           </w:p>
@@ -4797,15 +4769,7 @@
                 <w:b/>
                 <w:sz w:val="13"/>
               </w:rPr>
-              <w:t xml:space="preserve">Тимлид, разработчики, аналитик, </w:t>
-            </w:r>
-            <w:r>
-              <w:rPr>
-                <w:b/>
-                <w:sz w:val="13"/>
-              </w:rPr>
-              <w:lastRenderedPageBreak/>
-              <w:t>тестировщик</w:t>
+              <w:t>Тимлид, разработчики, аналитик, тестировщик</w:t>
             </w:r>
           </w:p>
         </w:tc>
@@ -4817,11 +4781,9 @@
           <w:p>
             <w:r>
               <w:rPr>
-                <w:b/>
-                <w:sz w:val="13"/>
-              </w:rPr>
-              <w:lastRenderedPageBreak/>
-              <w:t>Important</w:t>
+                <w:sz w:val="14"/>
+              </w:rPr>
+              <w:t>—</w:t>
             </w:r>
           </w:p>
         </w:tc>
@@ -4957,9 +4919,9 @@
           <w:p>
             <w:r>
               <w:rPr>
-                <w:sz w:val="13"/>
-              </w:rPr>
-              <w:t>Important</w:t>
+                <w:sz w:val="14"/>
+              </w:rPr>
+              <w:t>Medium</w:t>
             </w:r>
           </w:p>
         </w:tc>
@@ -5094,7 +5056,7 @@
           <w:p>
             <w:r>
               <w:rPr>
-                <w:sz w:val="13"/>
+                <w:sz w:val="14"/>
               </w:rPr>
               <w:t>Important</w:t>
             </w:r>
@@ -5225,7 +5187,7 @@
           <w:p>
             <w:r>
               <w:rPr>
-                <w:sz w:val="13"/>
+                <w:sz w:val="14"/>
               </w:rPr>
               <w:t>Important</w:t>
             </w:r>
@@ -5356,9 +5318,9 @@
           <w:p>
             <w:r>
               <w:rPr>
-                <w:sz w:val="13"/>
-              </w:rPr>
-              <w:t>Important</w:t>
+                <w:sz w:val="14"/>
+              </w:rPr>
+              <w:t>—</w:t>
             </w:r>
           </w:p>
         </w:tc>
@@ -5494,10 +5456,9 @@
           <w:p>
             <w:r>
               <w:rPr>
-                <w:b/>
-                <w:sz w:val="13"/>
-              </w:rPr>
-              <w:t>Medium</w:t>
+                <w:sz w:val="14"/>
+              </w:rPr>
+              <w:t>—</w:t>
             </w:r>
           </w:p>
         </w:tc>
@@ -5633,7 +5594,7 @@
           <w:p>
             <w:r>
               <w:rPr>
-                <w:sz w:val="13"/>
+                <w:sz w:val="14"/>
               </w:rPr>
               <w:t>Medium</w:t>
             </w:r>
@@ -5764,9 +5725,9 @@
           <w:p>
             <w:r>
               <w:rPr>
-                <w:sz w:val="13"/>
-              </w:rPr>
-              <w:t>Medium</w:t>
+                <w:sz w:val="14"/>
+              </w:rPr>
+              <w:t>Important</w:t>
             </w:r>
           </w:p>
         </w:tc>
@@ -5895,9 +5856,9 @@
           <w:p>
             <w:r>
               <w:rPr>
-                <w:sz w:val="13"/>
-              </w:rPr>
-              <w:t>Medium</w:t>
+                <w:sz w:val="14"/>
+              </w:rPr>
+              <w:t>Important</w:t>
             </w:r>
           </w:p>
         </w:tc>
@@ -6026,9 +5987,9 @@
           <w:p>
             <w:r>
               <w:rPr>
-                <w:sz w:val="13"/>
-              </w:rPr>
-              <w:t>Medium</w:t>
+                <w:sz w:val="14"/>
+              </w:rPr>
+              <w:t>—</w:t>
             </w:r>
           </w:p>
         </w:tc>
@@ -6213,10 +6174,9 @@
           <w:p>
             <w:r>
               <w:rPr>
-                <w:b/>
-                <w:sz w:val="13"/>
-              </w:rPr>
-              <w:t>Important</w:t>
+                <w:sz w:val="14"/>
+              </w:rPr>
+              <w:t>—</w:t>
             </w:r>
           </w:p>
         </w:tc>
@@ -6352,9 +6312,9 @@
           <w:p>
             <w:r>
               <w:rPr>
-                <w:sz w:val="13"/>
-              </w:rPr>
-              <w:t>Important</w:t>
+                <w:sz w:val="14"/>
+              </w:rPr>
+              <w:t>Medium</w:t>
             </w:r>
           </w:p>
         </w:tc>
@@ -6483,9 +6443,9 @@
           <w:p>
             <w:r>
               <w:rPr>
-                <w:sz w:val="13"/>
-              </w:rPr>
-              <w:t>Important</w:t>
+                <w:sz w:val="14"/>
+              </w:rPr>
+              <w:t>Medium</w:t>
             </w:r>
           </w:p>
         </w:tc>
@@ -6639,7 +6599,7 @@
           <w:p>
             <w:r>
               <w:rPr>
-                <w:sz w:val="13"/>
+                <w:sz w:val="14"/>
               </w:rPr>
               <w:t>Important</w:t>
             </w:r>
@@ -6770,9 +6730,9 @@
           <w:p>
             <w:r>
               <w:rPr>
-                <w:sz w:val="13"/>
-              </w:rPr>
-              <w:t>Important</w:t>
+                <w:sz w:val="14"/>
+              </w:rPr>
+              <w:t>—</w:t>
             </w:r>
           </w:p>
         </w:tc>
@@ -6908,10 +6868,9 @@
           <w:p>
             <w:r>
               <w:rPr>
-                <w:b/>
-                <w:sz w:val="13"/>
-              </w:rPr>
-              <w:t>Important</w:t>
+                <w:sz w:val="14"/>
+              </w:rPr>
+              <w:t>—</w:t>
             </w:r>
           </w:p>
         </w:tc>
@@ -7047,9 +7006,9 @@
           <w:p>
             <w:r>
               <w:rPr>
-                <w:sz w:val="13"/>
-              </w:rPr>
-              <w:t>Important</w:t>
+                <w:sz w:val="14"/>
+              </w:rPr>
+              <w:t>Medium</w:t>
             </w:r>
           </w:p>
         </w:tc>
@@ -7178,7 +7137,7 @@
           <w:p>
             <w:r>
               <w:rPr>
-                <w:sz w:val="13"/>
+                <w:sz w:val="14"/>
               </w:rPr>
               <w:t>Important</w:t>
             </w:r>
@@ -7309,9 +7268,9 @@
           <w:p>
             <w:r>
               <w:rPr>
-                <w:sz w:val="13"/>
-              </w:rPr>
-              <w:t>Important</w:t>
+                <w:sz w:val="14"/>
+              </w:rPr>
+              <w:t>Medium</w:t>
             </w:r>
           </w:p>
         </w:tc>
@@ -7447,10 +7406,9 @@
           <w:p>
             <w:r>
               <w:rPr>
-                <w:b/>
-                <w:sz w:val="13"/>
-              </w:rPr>
-              <w:t>Important</w:t>
+                <w:sz w:val="14"/>
+              </w:rPr>
+              <w:t>—</w:t>
             </w:r>
           </w:p>
         </w:tc>
@@ -7586,9 +7544,9 @@
           <w:p>
             <w:r>
               <w:rPr>
-                <w:sz w:val="13"/>
-              </w:rPr>
-              <w:t>Important</w:t>
+                <w:sz w:val="14"/>
+              </w:rPr>
+              <w:t>Medium</w:t>
             </w:r>
           </w:p>
         </w:tc>
@@ -7717,7 +7675,7 @@
           <w:p>
             <w:r>
               <w:rPr>
-                <w:sz w:val="13"/>
+                <w:sz w:val="14"/>
               </w:rPr>
               <w:t>Important</w:t>
             </w:r>
@@ -7848,9 +7806,9 @@
           <w:p>
             <w:r>
               <w:rPr>
-                <w:sz w:val="13"/>
-              </w:rPr>
-              <w:t>Important</w:t>
+                <w:sz w:val="14"/>
+              </w:rPr>
+              <w:t>Medium</w:t>
             </w:r>
           </w:p>
         </w:tc>
@@ -7979,9 +7937,9 @@
           <w:p>
             <w:r>
               <w:rPr>
-                <w:sz w:val="13"/>
-              </w:rPr>
-              <w:t>Important</w:t>
+                <w:sz w:val="14"/>
+              </w:rPr>
+              <w:t>—</w:t>
             </w:r>
           </w:p>
         </w:tc>
@@ -8117,10 +8075,9 @@
           <w:p>
             <w:r>
               <w:rPr>
-                <w:b/>
-                <w:sz w:val="13"/>
-              </w:rPr>
-              <w:t>Important</w:t>
+                <w:sz w:val="14"/>
+              </w:rPr>
+              <w:t>—</w:t>
             </w:r>
           </w:p>
         </w:tc>
@@ -8256,9 +8213,9 @@
           <w:p>
             <w:r>
               <w:rPr>
-                <w:sz w:val="13"/>
-              </w:rPr>
-              <w:t>Important</w:t>
+                <w:sz w:val="14"/>
+              </w:rPr>
+              <w:t>Medium</w:t>
             </w:r>
           </w:p>
         </w:tc>
@@ -8387,7 +8344,7 @@
           <w:p>
             <w:r>
               <w:rPr>
-                <w:sz w:val="13"/>
+                <w:sz w:val="14"/>
               </w:rPr>
               <w:t>Important</w:t>
             </w:r>
@@ -8518,9 +8475,9 @@
           <w:p>
             <w:r>
               <w:rPr>
-                <w:sz w:val="13"/>
-              </w:rPr>
-              <w:t>Important</w:t>
+                <w:sz w:val="14"/>
+              </w:rPr>
+              <w:t>Medium</w:t>
             </w:r>
           </w:p>
         </w:tc>
@@ -8656,10 +8613,9 @@
           <w:p>
             <w:r>
               <w:rPr>
-                <w:b/>
-                <w:sz w:val="13"/>
-              </w:rPr>
-              <w:t>Important</w:t>
+                <w:sz w:val="14"/>
+              </w:rPr>
+              <w:t>—</w:t>
             </w:r>
           </w:p>
         </w:tc>
@@ -8795,7 +8751,7 @@
           <w:p>
             <w:r>
               <w:rPr>
-                <w:sz w:val="13"/>
+                <w:sz w:val="14"/>
               </w:rPr>
               <w:t>Important</w:t>
             </w:r>
@@ -8926,7 +8882,7 @@
           <w:p>
             <w:r>
               <w:rPr>
-                <w:sz w:val="13"/>
+                <w:sz w:val="14"/>
               </w:rPr>
               <w:t>Important</w:t>
             </w:r>
@@ -9057,7 +9013,7 @@
           <w:p>
             <w:r>
               <w:rPr>
-                <w:sz w:val="13"/>
+                <w:sz w:val="14"/>
               </w:rPr>
               <w:t>Important</w:t>
             </w:r>
@@ -9223,10 +9179,9 @@
           <w:p>
             <w:r>
               <w:rPr>
-                <w:b/>
-                <w:sz w:val="13"/>
-              </w:rPr>
-              <w:t>Important</w:t>
+                <w:sz w:val="14"/>
+              </w:rPr>
+              <w:t>—</w:t>
             </w:r>
           </w:p>
         </w:tc>
@@ -9356,9 +9311,9 @@
           <w:p>
             <w:r>
               <w:rPr>
-                <w:sz w:val="13"/>
-              </w:rPr>
-              <w:t>Important</w:t>
+                <w:sz w:val="14"/>
+              </w:rPr>
+              <w:t>Medium</w:t>
             </w:r>
           </w:p>
         </w:tc>
@@ -9512,9 +9467,9 @@
           <w:p>
             <w:r>
               <w:rPr>
-                <w:sz w:val="13"/>
-              </w:rPr>
-              <w:t>Important</w:t>
+                <w:sz w:val="14"/>
+              </w:rPr>
+              <w:t>Medium</w:t>
             </w:r>
           </w:p>
         </w:tc>
@@ -9649,9 +9604,9 @@
           <w:p>
             <w:r>
               <w:rPr>
-                <w:sz w:val="13"/>
-              </w:rPr>
-              <w:t>Important</w:t>
+                <w:sz w:val="14"/>
+              </w:rPr>
+              <w:t>Medium</w:t>
             </w:r>
           </w:p>
         </w:tc>
@@ -9815,10 +9770,9 @@
           <w:p>
             <w:r>
               <w:rPr>
-                <w:b/>
-                <w:sz w:val="13"/>
-              </w:rPr>
-              <w:t>Important</w:t>
+                <w:sz w:val="14"/>
+              </w:rPr>
+              <w:t>—</w:t>
             </w:r>
           </w:p>
         </w:tc>
@@ -9954,7 +9908,7 @@
           <w:p>
             <w:r>
               <w:rPr>
-                <w:sz w:val="13"/>
+                <w:sz w:val="14"/>
               </w:rPr>
               <w:t>Important</w:t>
             </w:r>
@@ -10085,7 +10039,7 @@
           <w:p>
             <w:r>
               <w:rPr>
-                <w:sz w:val="13"/>
+                <w:sz w:val="14"/>
               </w:rPr>
               <w:t>Important</w:t>
             </w:r>
@@ -10222,7 +10176,7 @@
           <w:p>
             <w:r>
               <w:rPr>
-                <w:sz w:val="13"/>
+                <w:sz w:val="14"/>
               </w:rPr>
               <w:t>Important</w:t>
             </w:r>
@@ -10391,9 +10345,9 @@
           <w:p>
             <w:r>
               <w:rPr>
-                <w:sz w:val="13"/>
-              </w:rPr>
-              <w:t>Important</w:t>
+                <w:sz w:val="14"/>
+              </w:rPr>
+              <w:t>—</w:t>
             </w:r>
           </w:p>
         </w:tc>
@@ -10542,10 +10496,9 @@
           <w:p>
             <w:r>
               <w:rPr>
-                <w:b/>
-                <w:sz w:val="13"/>
-              </w:rPr>
-              <w:t>Important</w:t>
+                <w:sz w:val="14"/>
+              </w:rPr>
+              <w:t>—</w:t>
             </w:r>
           </w:p>
         </w:tc>
@@ -10681,9 +10634,9 @@
           <w:p>
             <w:r>
               <w:rPr>
-                <w:sz w:val="13"/>
-              </w:rPr>
-              <w:t>Important</w:t>
+                <w:sz w:val="14"/>
+              </w:rPr>
+              <w:t>Medium</w:t>
             </w:r>
           </w:p>
         </w:tc>
@@ -10812,9 +10765,9 @@
           <w:p>
             <w:r>
               <w:rPr>
-                <w:sz w:val="13"/>
-              </w:rPr>
-              <w:t>Important</w:t>
+                <w:sz w:val="14"/>
+              </w:rPr>
+              <w:t>Medium</w:t>
             </w:r>
           </w:p>
         </w:tc>
@@ -10943,7 +10896,7 @@
           <w:p>
             <w:r>
               <w:rPr>
-                <w:sz w:val="13"/>
+                <w:sz w:val="14"/>
               </w:rPr>
               <w:t>Important</w:t>
             </w:r>
@@ -11074,9 +11027,9 @@
           <w:p>
             <w:r>
               <w:rPr>
-                <w:sz w:val="13"/>
-              </w:rPr>
-              <w:t>Important</w:t>
+                <w:sz w:val="14"/>
+              </w:rPr>
+              <w:t>—</w:t>
             </w:r>
           </w:p>
         </w:tc>
@@ -11212,10 +11165,9 @@
           <w:p>
             <w:r>
               <w:rPr>
-                <w:b/>
-                <w:sz w:val="13"/>
-              </w:rPr>
-              <w:t>Low</w:t>
+                <w:sz w:val="14"/>
+              </w:rPr>
+              <w:t>—</w:t>
             </w:r>
           </w:p>
         </w:tc>
@@ -11370,7 +11322,7 @@
           <w:p>
             <w:r>
               <w:rPr>
-                <w:sz w:val="13"/>
+                <w:sz w:val="14"/>
               </w:rPr>
               <w:t>Low</w:t>
             </w:r>
@@ -11405,7 +11357,6 @@
         <w:rPr>
           <w:lang w:val="ru-RU"/>
         </w:rPr>
-        <w:lastRenderedPageBreak/>
         <w:t xml:space="preserve">Часть </w:t>
       </w:r>
       <w:r>
@@ -11508,7 +11459,7 @@
                 <w:b/>
                 <w:sz w:val="16"/>
               </w:rPr>
-              <w:t>Приоритет</w:t>
+              <w:t>Приоритет задачи</w:t>
             </w:r>
           </w:p>
         </w:tc>
@@ -11963,7 +11914,7 @@
               <w:rPr>
                 <w:sz w:val="16"/>
               </w:rPr>
-              <w:t>Important</w:t>
+              <w:t>Medium</w:t>
             </w:r>
           </w:p>
         </w:tc>
@@ -12088,7 +12039,7 @@
               <w:rPr>
                 <w:sz w:val="16"/>
               </w:rPr>
-              <w:t>Important</w:t>
+              <w:t>Medium</w:t>
             </w:r>
           </w:p>
         </w:tc>
@@ -12227,7 +12178,7 @@
               <w:rPr>
                 <w:sz w:val="16"/>
               </w:rPr>
-              <w:t>Important</w:t>
+              <w:t>Medium</w:t>
             </w:r>
           </w:p>
         </w:tc>
@@ -12303,7 +12254,7 @@
               <w:rPr>
                 <w:sz w:val="16"/>
               </w:rPr>
-              <w:t>Important</w:t>
+              <w:t>Medium</w:t>
             </w:r>
           </w:p>
         </w:tc>
@@ -12443,7 +12394,7 @@
               <w:rPr>
                 <w:sz w:val="16"/>
               </w:rPr>
-              <w:t>Important</w:t>
+              <w:t>Medium</w:t>
             </w:r>
           </w:p>
         </w:tc>
@@ -12519,7 +12470,7 @@
               <w:rPr>
                 <w:sz w:val="16"/>
               </w:rPr>
-              <w:t>Important</w:t>
+              <w:t>Medium</w:t>
             </w:r>
           </w:p>
         </w:tc>
@@ -12799,7 +12750,7 @@
               <w:rPr>
                 <w:sz w:val="16"/>
               </w:rPr>
-              <w:t>Medium</w:t>
+              <w:t>Important</w:t>
             </w:r>
           </w:p>
         </w:tc>
@@ -12869,7 +12820,7 @@
               <w:rPr>
                 <w:sz w:val="16"/>
               </w:rPr>
-              <w:t>Medium</w:t>
+              <w:t>Important</w:t>
             </w:r>
           </w:p>
         </w:tc>
@@ -13007,7 +12958,7 @@
               <w:rPr>
                 <w:sz w:val="16"/>
               </w:rPr>
-              <w:t>Important</w:t>
+              <w:t>Medium</w:t>
             </w:r>
           </w:p>
         </w:tc>
@@ -13145,7 +13096,7 @@
               <w:rPr>
                 <w:sz w:val="16"/>
               </w:rPr>
-              <w:t>Important</w:t>
+              <w:t>Medium</w:t>
             </w:r>
           </w:p>
         </w:tc>
@@ -13398,7 +13349,7 @@
               <w:rPr>
                 <w:sz w:val="16"/>
               </w:rPr>
-              <w:t>Important</w:t>
+              <w:t>Medium</w:t>
             </w:r>
           </w:p>
         </w:tc>
@@ -13538,7 +13489,7 @@
               <w:rPr>
                 <w:sz w:val="16"/>
               </w:rPr>
-              <w:t>Important</w:t>
+              <w:t>Medium</w:t>
             </w:r>
           </w:p>
         </w:tc>
@@ -13608,7 +13559,7 @@
               <w:rPr>
                 <w:sz w:val="16"/>
               </w:rPr>
-              <w:t>Important</w:t>
+              <w:t>Medium</w:t>
             </w:r>
           </w:p>
         </w:tc>
@@ -13748,7 +13699,7 @@
               <w:rPr>
                 <w:sz w:val="16"/>
               </w:rPr>
-              <w:t>Important</w:t>
+              <w:t>Medium</w:t>
             </w:r>
           </w:p>
         </w:tc>
@@ -13818,7 +13769,7 @@
               <w:rPr>
                 <w:sz w:val="16"/>
               </w:rPr>
-              <w:t>Important</w:t>
+              <w:t>Medium</w:t>
             </w:r>
           </w:p>
         </w:tc>
@@ -13958,7 +13909,7 @@
               <w:rPr>
                 <w:sz w:val="16"/>
               </w:rPr>
-              <w:t>Important</w:t>
+              <w:t>Medium</w:t>
             </w:r>
           </w:p>
         </w:tc>
@@ -14293,7 +14244,7 @@
               <w:rPr>
                 <w:sz w:val="16"/>
               </w:rPr>
-              <w:t>Important</w:t>
+              <w:t>Medium</w:t>
             </w:r>
           </w:p>
         </w:tc>
@@ -14449,7 +14400,7 @@
               <w:rPr>
                 <w:sz w:val="16"/>
               </w:rPr>
-              <w:t>Important</w:t>
+              <w:t>Medium</w:t>
             </w:r>
           </w:p>
         </w:tc>
@@ -14586,7 +14537,7 @@
               <w:rPr>
                 <w:sz w:val="16"/>
               </w:rPr>
-              <w:t>Important</w:t>
+              <w:t>Medium</w:t>
             </w:r>
           </w:p>
         </w:tc>
@@ -14604,6 +14555,7 @@
               <w:rPr>
                 <w:sz w:val="16"/>
               </w:rPr>
+              <w:lastRenderedPageBreak/>
               <w:t>12.1</w:t>
             </w:r>
           </w:p>
@@ -14968,14 +14920,7 @@
               <w:rPr>
                 <w:sz w:val="16"/>
               </w:rPr>
-              <w:t>Post-release support и проверка бизнес-</w:t>
-            </w:r>
-            <w:r>
-              <w:rPr>
-                <w:sz w:val="16"/>
-              </w:rPr>
-              <w:lastRenderedPageBreak/>
-              <w:t>цели</w:t>
+              <w:t>Post-release support и проверка бизнес-цели</w:t>
             </w:r>
           </w:p>
         </w:tc>
@@ -14994,79 +14939,69 @@
                 <w:sz w:val="16"/>
                 <w:lang w:val="ru-RU"/>
               </w:rPr>
-              <w:lastRenderedPageBreak/>
-              <w:t xml:space="preserve">Мониторить работу приложения после </w:t>
-            </w:r>
-            <w:r>
-              <w:rPr>
-                <w:sz w:val="16"/>
-                <w:lang w:val="ru-RU"/>
-              </w:rPr>
-              <w:lastRenderedPageBreak/>
+              <w:t>Мониторить работу приложения после релиза</w:t>
+            </w:r>
+          </w:p>
+        </w:tc>
+        <w:tc>
+          <w:tcPr>
+            <w:tcW w:w="3500" w:type="dxa"/>
+          </w:tcPr>
+          <w:p>
+            <w:proofErr w:type="spellStart"/>
+            <w:r>
+              <w:rPr>
+                <w:sz w:val="16"/>
+              </w:rPr>
+              <w:t>Проверка</w:t>
+            </w:r>
+            <w:proofErr w:type="spellEnd"/>
+            <w:r>
+              <w:rPr>
+                <w:sz w:val="16"/>
+              </w:rPr>
+              <w:t xml:space="preserve"> </w:t>
+            </w:r>
+            <w:proofErr w:type="spellStart"/>
+            <w:r>
+              <w:rPr>
+                <w:sz w:val="16"/>
+              </w:rPr>
+              <w:t>проблем</w:t>
+            </w:r>
+            <w:proofErr w:type="spellEnd"/>
+            <w:r>
+              <w:rPr>
+                <w:sz w:val="16"/>
+              </w:rPr>
+              <w:t xml:space="preserve"> </w:t>
+            </w:r>
+            <w:proofErr w:type="spellStart"/>
+            <w:r>
+              <w:rPr>
+                <w:sz w:val="16"/>
+              </w:rPr>
+              <w:t>после</w:t>
+            </w:r>
+            <w:proofErr w:type="spellEnd"/>
+            <w:r>
+              <w:rPr>
+                <w:sz w:val="16"/>
+              </w:rPr>
+              <w:t xml:space="preserve"> </w:t>
+            </w:r>
+            <w:proofErr w:type="spellStart"/>
+            <w:r>
+              <w:rPr>
+                <w:sz w:val="16"/>
+              </w:rPr>
               <w:t>релиза</w:t>
             </w:r>
-          </w:p>
-        </w:tc>
-        <w:tc>
-          <w:tcPr>
-            <w:tcW w:w="3500" w:type="dxa"/>
-          </w:tcPr>
-          <w:p>
-            <w:proofErr w:type="spellStart"/>
-            <w:r>
-              <w:rPr>
-                <w:sz w:val="16"/>
-              </w:rPr>
-              <w:lastRenderedPageBreak/>
-              <w:t>Проверка</w:t>
-            </w:r>
             <w:proofErr w:type="spellEnd"/>
             <w:r>
               <w:rPr>
                 <w:sz w:val="16"/>
               </w:rPr>
-              <w:t xml:space="preserve"> </w:t>
-            </w:r>
-            <w:proofErr w:type="spellStart"/>
-            <w:r>
-              <w:rPr>
-                <w:sz w:val="16"/>
-              </w:rPr>
-              <w:t>проблем</w:t>
-            </w:r>
-            <w:proofErr w:type="spellEnd"/>
-            <w:r>
-              <w:rPr>
-                <w:sz w:val="16"/>
-              </w:rPr>
-              <w:t xml:space="preserve"> </w:t>
-            </w:r>
-            <w:proofErr w:type="spellStart"/>
-            <w:r>
-              <w:rPr>
-                <w:sz w:val="16"/>
-              </w:rPr>
-              <w:t>после</w:t>
-            </w:r>
-            <w:proofErr w:type="spellEnd"/>
-            <w:r>
-              <w:rPr>
-                <w:sz w:val="16"/>
-              </w:rPr>
-              <w:t xml:space="preserve"> </w:t>
-            </w:r>
-            <w:proofErr w:type="spellStart"/>
-            <w:r>
-              <w:rPr>
-                <w:sz w:val="16"/>
-              </w:rPr>
-              <w:t>релиза</w:t>
-            </w:r>
-            <w:proofErr w:type="spellEnd"/>
-            <w:r>
-              <w:rPr>
-                <w:sz w:val="16"/>
-              </w:rPr>
               <w:t>.</w:t>
             </w:r>
           </w:p>
@@ -15080,7 +15015,7 @@
               <w:rPr>
                 <w:sz w:val="16"/>
               </w:rPr>
-              <w:t>Important</w:t>
+              <w:t>Medium</w:t>
             </w:r>
           </w:p>
         </w:tc>
@@ -15150,7 +15085,7 @@
               <w:rPr>
                 <w:sz w:val="16"/>
               </w:rPr>
-              <w:t>Important</w:t>
+              <w:t>Medium</w:t>
             </w:r>
           </w:p>
         </w:tc>
@@ -15334,8 +15269,13 @@
         <w:pStyle w:val="Heading2"/>
         <w:spacing w:after="120"/>
       </w:pPr>
+      <w:proofErr w:type="spellStart"/>
       <w:r>
-        <w:t>Приоритизация backlog</w:t>
+        <w:t>Приоритизация</w:t>
+      </w:r>
+      <w:proofErr w:type="spellEnd"/>
+      <w:r>
+        <w:t xml:space="preserve"> backlog</w:t>
       </w:r>
     </w:p>
     <w:tbl>
@@ -15417,33 +15357,34 @@
                 <w:sz w:val="16"/>
                 <w:lang w:val="ru-RU"/>
               </w:rPr>
-              <w:t xml:space="preserve">Инициация и требования; </w:t>
-            </w:r>
-            <w:r>
-              <w:rPr>
-                <w:sz w:val="16"/>
-              </w:rPr>
-              <w:t>UX</w:t>
+              <w:t xml:space="preserve">Провести анализ 5 конкурентов </w:t>
             </w:r>
             <w:r>
               <w:rPr>
                 <w:sz w:val="16"/>
                 <w:lang w:val="ru-RU"/>
               </w:rPr>
-              <w:t>/</w:t>
-            </w:r>
-            <w:r>
-              <w:rPr>
-                <w:sz w:val="16"/>
-              </w:rPr>
-              <w:t>UI</w:t>
+              <w:t>, с</w:t>
             </w:r>
             <w:r>
               <w:rPr>
                 <w:sz w:val="16"/>
                 <w:lang w:val="ru-RU"/>
               </w:rPr>
-              <w:t xml:space="preserve">; личный кабинет; калькулятор калорий; продукты; блюда; тренировки; лицензионный договор; </w:t>
+              <w:t xml:space="preserve">формировать требования </w:t>
+            </w:r>
+            <w:r>
+              <w:rPr>
+                <w:sz w:val="16"/>
+              </w:rPr>
+              <w:t>MVP</w:t>
+            </w:r>
+            <w:r>
+              <w:rPr>
+                <w:sz w:val="16"/>
+                <w:lang w:val="ru-RU"/>
+              </w:rPr>
+              <w:t xml:space="preserve">; зафиксировать ограничения проекта; реализовать экран профиля; реализовать калькулятор калорий; протестировать расчет калорий; реализовать калькулятор воды; протестировать калькулятор воды; подготовить требования для публикации в </w:t>
             </w:r>
             <w:r>
               <w:rPr>
@@ -15469,59 +15410,7 @@
                 <w:sz w:val="16"/>
                 <w:lang w:val="ru-RU"/>
               </w:rPr>
-              <w:t xml:space="preserve"> </w:t>
-            </w:r>
-            <w:r>
-              <w:rPr>
-                <w:sz w:val="16"/>
-              </w:rPr>
-              <w:t>prerequisites</w:t>
-            </w:r>
-            <w:r>
-              <w:rPr>
-                <w:sz w:val="16"/>
-                <w:lang w:val="ru-RU"/>
-              </w:rPr>
-              <w:t xml:space="preserve">; платный доступ; маркетинг; </w:t>
-            </w:r>
-            <w:r>
-              <w:rPr>
-                <w:sz w:val="16"/>
-              </w:rPr>
-              <w:t>QA</w:t>
-            </w:r>
-            <w:r>
-              <w:rPr>
-                <w:sz w:val="16"/>
-                <w:lang w:val="ru-RU"/>
-              </w:rPr>
-              <w:t xml:space="preserve">; релиз; </w:t>
-            </w:r>
-            <w:r>
-              <w:rPr>
-                <w:sz w:val="16"/>
-              </w:rPr>
-              <w:t>post</w:t>
-            </w:r>
-            <w:r>
-              <w:rPr>
-                <w:sz w:val="16"/>
-                <w:lang w:val="ru-RU"/>
-              </w:rPr>
-              <w:t>-</w:t>
-            </w:r>
-            <w:r>
-              <w:rPr>
-                <w:sz w:val="16"/>
-              </w:rPr>
-              <w:t>release</w:t>
-            </w:r>
-            <w:r>
-              <w:rPr>
-                <w:sz w:val="16"/>
-                <w:lang w:val="ru-RU"/>
-              </w:rPr>
-              <w:t xml:space="preserve"> поддержка и проверка 500 платных пользователей.</w:t>
+              <w:t>; реализовать список продуктов; реализовать список блюд; реализовать план тренировок; определить модель платного доступа; реализовать платный доступ; протестировать платный доступ; провести регрессионное тестирование; исправить критичные дефекты; провести финальную проверку перед публикацией; отслеживать количество платных пользователей.</w:t>
             </w:r>
           </w:p>
         </w:tc>
@@ -15560,7 +15449,40 @@
                 <w:sz w:val="16"/>
                 <w:lang w:val="ru-RU"/>
               </w:rPr>
-              <w:t>Калькулятор воды: входит в план, оценка 160 часов; может быть исключен при нехватке времени или бюджета.</w:t>
+              <w:t>О</w:t>
+            </w:r>
+            <w:r>
+              <w:rPr>
+                <w:sz w:val="16"/>
+                <w:lang w:val="ru-RU"/>
+              </w:rPr>
+              <w:t xml:space="preserve">писать основные пользовательские сценарии; подготовить структуру экранов; подготовить прототипы основных разделов; описать данные профиля пользователя; протестировать профиль пользователя; описать логику расчета калорий; описать логику расчета воды; подготовить лицензионный договор; согласовать лицензионный договор; подготовить структуру каталога продуктов; протестировать список продуктов; подготовить структуру списка блюд; протестировать список блюд; описать логику персонального плана; протестировать план тренировок; подготовить позиционирование приложения; подготовить описание для </w:t>
+            </w:r>
+            <w:r>
+              <w:rPr>
+                <w:sz w:val="16"/>
+              </w:rPr>
+              <w:t>App</w:t>
+            </w:r>
+            <w:r>
+              <w:rPr>
+                <w:sz w:val="16"/>
+                <w:lang w:val="ru-RU"/>
+              </w:rPr>
+              <w:t xml:space="preserve"> </w:t>
+            </w:r>
+            <w:r>
+              <w:rPr>
+                <w:sz w:val="16"/>
+              </w:rPr>
+              <w:t>Store</w:t>
+            </w:r>
+            <w:r>
+              <w:rPr>
+                <w:sz w:val="16"/>
+                <w:lang w:val="ru-RU"/>
+              </w:rPr>
+              <w:t>; подготовить скриншоты и материалы запуска; мониторить работу приложения после релиза; обрабатывать обращения пользователей.</w:t>
             </w:r>
           </w:p>
         </w:tc>
@@ -15597,6 +15519,13 @@
             <w:r>
               <w:rPr>
                 <w:sz w:val="16"/>
+                <w:lang w:val="ru-RU"/>
+              </w:rPr>
+              <w:t xml:space="preserve">Зафиксировать функцию </w:t>
+            </w:r>
+            <w:r>
+              <w:rPr>
+                <w:sz w:val="16"/>
               </w:rPr>
               <w:t>Share</w:t>
             </w:r>
@@ -15605,20 +15534,7 @@
                 <w:sz w:val="16"/>
                 <w:lang w:val="ru-RU"/>
               </w:rPr>
-              <w:t xml:space="preserve"> / социальная функция: не входит в </w:t>
-            </w:r>
-            <w:r>
-              <w:rPr>
-                <w:sz w:val="16"/>
-              </w:rPr>
-              <w:t>MVP</w:t>
-            </w:r>
-            <w:r>
-              <w:rPr>
-                <w:sz w:val="16"/>
-                <w:lang w:val="ru-RU"/>
-              </w:rPr>
-              <w:t xml:space="preserve"> 1.0, фиксируется в </w:t>
+              <w:t xml:space="preserve"> / социальную функцию в </w:t>
             </w:r>
             <w:r>
               <w:rPr>
@@ -16032,7 +15948,21 @@
               <w:rPr>
                 <w:lang w:val="ru-RU"/>
               </w:rPr>
-              <w:t xml:space="preserve"> может работать через калькулятор калорий и список продуктов.</w:t>
+              <w:t xml:space="preserve"> может работать </w:t>
+            </w:r>
+            <w:proofErr w:type="gramStart"/>
+            <w:r>
+              <w:rPr>
+                <w:lang w:val="ru-RU"/>
+              </w:rPr>
+              <w:t>через калькулятор</w:t>
+            </w:r>
+            <w:proofErr w:type="gramEnd"/>
+            <w:r>
+              <w:rPr>
+                <w:lang w:val="ru-RU"/>
+              </w:rPr>
+              <w:t xml:space="preserve"> калорий и список продуктов.</w:t>
             </w:r>
           </w:p>
         </w:tc>
@@ -16115,12 +16045,12 @@
         <w:tblLook w:val="04A0" w:firstRow="1" w:lastRow="0" w:firstColumn="1" w:lastColumn="0" w:noHBand="0" w:noVBand="1"/>
       </w:tblPr>
       <w:tblGrid>
-        <w:gridCol w:w="3100"/>
-        <w:gridCol w:w="900"/>
-        <w:gridCol w:w="1300"/>
-        <w:gridCol w:w="850"/>
-        <w:gridCol w:w="850"/>
-        <w:gridCol w:w="8500"/>
+        <w:gridCol w:w="2610"/>
+        <w:gridCol w:w="927"/>
+        <w:gridCol w:w="1264"/>
+        <w:gridCol w:w="927"/>
+        <w:gridCol w:w="927"/>
+        <w:gridCol w:w="8845"/>
       </w:tblGrid>
       <w:tr>
         <w:trPr>
@@ -16128,13 +16058,14 @@
         </w:trPr>
         <w:tc>
           <w:tcPr>
-            <w:tcW w:w="3100" w:type="dxa"/>
+            <w:tcW w:w="2232" w:type="dxa"/>
             <w:shd w:val="clear" w:color="auto" w:fill="D9EAF7"/>
           </w:tcPr>
           <w:p>
             <w:r>
               <w:rPr>
                 <w:b/>
+                <w:sz w:val="16"/>
               </w:rPr>
               <w:t>Фича</w:t>
             </w:r>
@@ -16142,13 +16073,14 @@
         </w:tc>
         <w:tc>
           <w:tcPr>
-            <w:tcW w:w="900" w:type="dxa"/>
+            <w:tcW w:w="792" w:type="dxa"/>
             <w:shd w:val="clear" w:color="auto" w:fill="D9EAF7"/>
           </w:tcPr>
           <w:p>
             <w:r>
               <w:rPr>
                 <w:b/>
+                <w:sz w:val="16"/>
               </w:rPr>
               <w:t>Impact</w:t>
             </w:r>
@@ -16156,13 +16088,14 @@
         </w:tc>
         <w:tc>
           <w:tcPr>
-            <w:tcW w:w="1300" w:type="dxa"/>
+            <w:tcW w:w="1080" w:type="dxa"/>
             <w:shd w:val="clear" w:color="auto" w:fill="D9EAF7"/>
           </w:tcPr>
           <w:p>
             <w:r>
               <w:rPr>
                 <w:b/>
+                <w:sz w:val="16"/>
               </w:rPr>
               <w:t>Confidence</w:t>
             </w:r>
@@ -16170,13 +16103,14 @@
         </w:tc>
         <w:tc>
           <w:tcPr>
-            <w:tcW w:w="850" w:type="dxa"/>
+            <w:tcW w:w="792" w:type="dxa"/>
             <w:shd w:val="clear" w:color="auto" w:fill="D9EAF7"/>
           </w:tcPr>
           <w:p>
             <w:r>
               <w:rPr>
                 <w:b/>
+                <w:sz w:val="16"/>
               </w:rPr>
               <w:t>Ease</w:t>
             </w:r>
@@ -16184,13 +16118,14 @@
         </w:tc>
         <w:tc>
           <w:tcPr>
-            <w:tcW w:w="850" w:type="dxa"/>
+            <w:tcW w:w="792" w:type="dxa"/>
             <w:shd w:val="clear" w:color="auto" w:fill="D9EAF7"/>
           </w:tcPr>
           <w:p>
             <w:r>
               <w:rPr>
                 <w:b/>
+                <w:sz w:val="16"/>
               </w:rPr>
               <w:t>ICE</w:t>
             </w:r>
@@ -16198,15 +16133,16 @@
         </w:tc>
         <w:tc>
           <w:tcPr>
-            <w:tcW w:w="8500" w:type="dxa"/>
+            <w:tcW w:w="7560" w:type="dxa"/>
             <w:shd w:val="clear" w:color="auto" w:fill="D9EAF7"/>
           </w:tcPr>
           <w:p>
             <w:r>
               <w:rPr>
                 <w:b/>
-              </w:rPr>
-              <w:t>Обоснование</w:t>
+                <w:sz w:val="16"/>
+              </w:rPr>
+              <w:t>Обоснование I/C/E</w:t>
             </w:r>
           </w:p>
         </w:tc>
@@ -16217,83 +16153,132 @@
         </w:trPr>
         <w:tc>
           <w:tcPr>
-            <w:tcW w:w="3100" w:type="dxa"/>
-          </w:tcPr>
-          <w:p>
-            <w:r>
+            <w:tcW w:w="2232" w:type="dxa"/>
+          </w:tcPr>
+          <w:p>
+            <w:r>
+              <w:rPr>
+                <w:sz w:val="16"/>
+              </w:rPr>
               <w:t>Калькулятор калорий</w:t>
             </w:r>
           </w:p>
         </w:tc>
         <w:tc>
           <w:tcPr>
-            <w:tcW w:w="900" w:type="dxa"/>
-          </w:tcPr>
-          <w:p>
-            <w:r>
+            <w:tcW w:w="792" w:type="dxa"/>
+          </w:tcPr>
+          <w:p>
+            <w:r>
+              <w:rPr>
+                <w:sz w:val="16"/>
+              </w:rPr>
               <w:t>10</w:t>
             </w:r>
           </w:p>
         </w:tc>
         <w:tc>
           <w:tcPr>
-            <w:tcW w:w="1300" w:type="dxa"/>
-          </w:tcPr>
-          <w:p>
-            <w:r>
+            <w:tcW w:w="1080" w:type="dxa"/>
+          </w:tcPr>
+          <w:p>
+            <w:r>
+              <w:rPr>
+                <w:sz w:val="16"/>
+              </w:rPr>
               <w:t>9</w:t>
             </w:r>
           </w:p>
         </w:tc>
         <w:tc>
           <w:tcPr>
-            <w:tcW w:w="850" w:type="dxa"/>
-          </w:tcPr>
-          <w:p>
-            <w:r>
+            <w:tcW w:w="792" w:type="dxa"/>
+          </w:tcPr>
+          <w:p>
+            <w:r>
+              <w:rPr>
+                <w:sz w:val="16"/>
+              </w:rPr>
               <w:t>7</w:t>
             </w:r>
           </w:p>
         </w:tc>
         <w:tc>
           <w:tcPr>
-            <w:tcW w:w="850" w:type="dxa"/>
-          </w:tcPr>
-          <w:p>
-            <w:r>
+            <w:tcW w:w="792" w:type="dxa"/>
+          </w:tcPr>
+          <w:p>
+            <w:r>
+              <w:rPr>
+                <w:sz w:val="16"/>
+              </w:rPr>
               <w:t>630</w:t>
             </w:r>
           </w:p>
         </w:tc>
         <w:tc>
           <w:tcPr>
-            <w:tcW w:w="8500" w:type="dxa"/>
-          </w:tcPr>
-          <w:p>
-            <w:r>
-              <w:rPr>
+            <w:tcW w:w="7560" w:type="dxa"/>
+          </w:tcPr>
+          <w:p>
+            <w:r>
+              <w:rPr>
+                <w:sz w:val="16"/>
+              </w:rPr>
+              <w:t>Impact</w:t>
+            </w:r>
+            <w:r>
+              <w:rPr>
+                <w:sz w:val="16"/>
                 <w:lang w:val="ru-RU"/>
               </w:rPr>
-              <w:t xml:space="preserve">Главная фича для снижения веса. </w:t>
-            </w:r>
-            <w:r>
-              <w:t xml:space="preserve">Требует </w:t>
-            </w:r>
-            <w:proofErr w:type="spellStart"/>
-            <w:r>
-              <w:t>проверки</w:t>
-            </w:r>
-            <w:proofErr w:type="spellEnd"/>
-            <w:r>
-              <w:t xml:space="preserve"> </w:t>
-            </w:r>
-            <w:proofErr w:type="spellStart"/>
-            <w:r>
-              <w:t>расчета</w:t>
-            </w:r>
-            <w:proofErr w:type="spellEnd"/>
-            <w:r>
+              <w:t>: основная функция приложения для снижения веса.</w:t>
+            </w:r>
+            <w:r>
+              <w:rPr>
+                <w:sz w:val="16"/>
+                <w:lang w:val="ru-RU"/>
+              </w:rPr>
+              <w:br/>
+            </w:r>
+            <w:r>
+              <w:rPr>
+                <w:sz w:val="16"/>
+              </w:rPr>
+              <w:t>Confidence</w:t>
+            </w:r>
+            <w:r>
+              <w:rPr>
+                <w:sz w:val="16"/>
+                <w:lang w:val="ru-RU"/>
+              </w:rPr>
+              <w:t xml:space="preserve">: функция прямо следует из цели проекта и требований к </w:t>
+            </w:r>
+            <w:r>
+              <w:rPr>
+                <w:sz w:val="16"/>
+              </w:rPr>
+              <w:t>MVP</w:t>
+            </w:r>
+            <w:r>
+              <w:rPr>
+                <w:sz w:val="16"/>
+                <w:lang w:val="ru-RU"/>
+              </w:rPr>
               <w:t>.</w:t>
+            </w:r>
+            <w:r>
+              <w:rPr>
+                <w:sz w:val="16"/>
+                <w:lang w:val="ru-RU"/>
+              </w:rPr>
+              <w:br/>
+            </w:r>
+            <w:r>
+              <w:rPr>
+                <w:sz w:val="16"/>
+              </w:rPr>
+              <w:t>Ease: нужны формула расчета и проверка корректности данных.</w:t>
             </w:r>
           </w:p>
         </w:tc>
@@ -16304,69 +16289,175 @@
         </w:trPr>
         <w:tc>
           <w:tcPr>
-            <w:tcW w:w="3100" w:type="dxa"/>
-          </w:tcPr>
-          <w:p>
-            <w:r>
+            <w:tcW w:w="2232" w:type="dxa"/>
+          </w:tcPr>
+          <w:p>
+            <w:r>
+              <w:rPr>
+                <w:sz w:val="16"/>
+              </w:rPr>
               <w:t>Список продуктов</w:t>
             </w:r>
           </w:p>
         </w:tc>
         <w:tc>
           <w:tcPr>
-            <w:tcW w:w="900" w:type="dxa"/>
-          </w:tcPr>
-          <w:p>
-            <w:r>
+            <w:tcW w:w="792" w:type="dxa"/>
+          </w:tcPr>
+          <w:p>
+            <w:r>
+              <w:rPr>
+                <w:sz w:val="16"/>
+              </w:rPr>
               <w:t>9</w:t>
             </w:r>
           </w:p>
         </w:tc>
         <w:tc>
           <w:tcPr>
-            <w:tcW w:w="1300" w:type="dxa"/>
-          </w:tcPr>
-          <w:p>
-            <w:r>
+            <w:tcW w:w="1080" w:type="dxa"/>
+          </w:tcPr>
+          <w:p>
+            <w:r>
+              <w:rPr>
+                <w:sz w:val="16"/>
+              </w:rPr>
               <w:t>8</w:t>
             </w:r>
           </w:p>
         </w:tc>
         <w:tc>
           <w:tcPr>
-            <w:tcW w:w="850" w:type="dxa"/>
-          </w:tcPr>
-          <w:p>
-            <w:r>
+            <w:tcW w:w="792" w:type="dxa"/>
+          </w:tcPr>
+          <w:p>
+            <w:r>
+              <w:rPr>
+                <w:sz w:val="16"/>
+              </w:rPr>
               <w:t>7</w:t>
             </w:r>
           </w:p>
         </w:tc>
         <w:tc>
           <w:tcPr>
-            <w:tcW w:w="850" w:type="dxa"/>
-          </w:tcPr>
-          <w:p>
-            <w:r>
+            <w:tcW w:w="792" w:type="dxa"/>
+          </w:tcPr>
+          <w:p>
+            <w:r>
+              <w:rPr>
+                <w:sz w:val="16"/>
+              </w:rPr>
               <w:t>504</w:t>
             </w:r>
           </w:p>
         </w:tc>
         <w:tc>
           <w:tcPr>
-            <w:tcW w:w="8500" w:type="dxa"/>
-          </w:tcPr>
-          <w:p>
-            <w:pPr>
-              <w:rPr>
+            <w:tcW w:w="7560" w:type="dxa"/>
+          </w:tcPr>
+          <w:p>
+            <w:r>
+              <w:rPr>
+                <w:sz w:val="16"/>
+              </w:rPr>
+              <w:t>Impact</w:t>
+            </w:r>
+            <w:r>
+              <w:rPr>
+                <w:sz w:val="16"/>
                 <w:lang w:val="ru-RU"/>
               </w:rPr>
-            </w:pPr>
-            <w:r>
-              <w:rPr>
+              <w:t>: нужен для учета питания и работы калькулятора калорий.</w:t>
+            </w:r>
+            <w:r>
+              <w:rPr>
+                <w:sz w:val="16"/>
                 <w:lang w:val="ru-RU"/>
               </w:rPr>
-              <w:t>Нужен для учета питания. Требуется база продуктов.</w:t>
+              <w:br/>
+            </w:r>
+            <w:r>
+              <w:rPr>
+                <w:sz w:val="16"/>
+              </w:rPr>
+              <w:t>Confidence</w:t>
+            </w:r>
+            <w:r>
+              <w:rPr>
+                <w:sz w:val="16"/>
+                <w:lang w:val="ru-RU"/>
+              </w:rPr>
+              <w:t>: необходимость подтверждается требованиями и анализом конкурентов.</w:t>
+            </w:r>
+            <w:r>
+              <w:rPr>
+                <w:sz w:val="16"/>
+                <w:lang w:val="ru-RU"/>
+              </w:rPr>
+              <w:br/>
+            </w:r>
+            <w:r>
+              <w:rPr>
+                <w:sz w:val="16"/>
+              </w:rPr>
+              <w:t xml:space="preserve">Ease: </w:t>
+            </w:r>
+            <w:proofErr w:type="spellStart"/>
+            <w:r>
+              <w:rPr>
+                <w:sz w:val="16"/>
+              </w:rPr>
+              <w:t>требуется</w:t>
+            </w:r>
+            <w:proofErr w:type="spellEnd"/>
+            <w:r>
+              <w:rPr>
+                <w:sz w:val="16"/>
+              </w:rPr>
+              <w:t xml:space="preserve"> </w:t>
+            </w:r>
+            <w:proofErr w:type="spellStart"/>
+            <w:r>
+              <w:rPr>
+                <w:sz w:val="16"/>
+              </w:rPr>
+              <w:t>подготовить</w:t>
+            </w:r>
+            <w:proofErr w:type="spellEnd"/>
+            <w:r>
+              <w:rPr>
+                <w:sz w:val="16"/>
+              </w:rPr>
+              <w:t xml:space="preserve"> </w:t>
+            </w:r>
+            <w:proofErr w:type="spellStart"/>
+            <w:r>
+              <w:rPr>
+                <w:sz w:val="16"/>
+              </w:rPr>
+              <w:t>структуру</w:t>
+            </w:r>
+            <w:proofErr w:type="spellEnd"/>
+            <w:r>
+              <w:rPr>
+                <w:sz w:val="16"/>
+              </w:rPr>
+              <w:t xml:space="preserve"> </w:t>
+            </w:r>
+            <w:proofErr w:type="spellStart"/>
+            <w:r>
+              <w:rPr>
+                <w:sz w:val="16"/>
+              </w:rPr>
+              <w:t>каталога</w:t>
+            </w:r>
+            <w:proofErr w:type="spellEnd"/>
+            <w:r>
+              <w:rPr>
+                <w:sz w:val="16"/>
+              </w:rPr>
+              <w:t xml:space="preserve"> и данные по продуктам.</w:t>
             </w:r>
           </w:p>
         </w:tc>
@@ -16377,75 +16468,72 @@
         </w:trPr>
         <w:tc>
           <w:tcPr>
-            <w:tcW w:w="3100" w:type="dxa"/>
-          </w:tcPr>
-          <w:p>
-            <w:proofErr w:type="spellStart"/>
-            <w:r>
-              <w:t>Персональный</w:t>
-            </w:r>
-            <w:proofErr w:type="spellEnd"/>
-            <w:r>
-              <w:t xml:space="preserve"> </w:t>
-            </w:r>
-            <w:proofErr w:type="spellStart"/>
-            <w:r>
-              <w:t>план</w:t>
-            </w:r>
-            <w:proofErr w:type="spellEnd"/>
-            <w:r>
-              <w:t xml:space="preserve"> </w:t>
-            </w:r>
-            <w:proofErr w:type="spellStart"/>
-            <w:r>
-              <w:t>тренировок</w:t>
-            </w:r>
-            <w:proofErr w:type="spellEnd"/>
-          </w:p>
-        </w:tc>
-        <w:tc>
-          <w:tcPr>
-            <w:tcW w:w="900" w:type="dxa"/>
-          </w:tcPr>
-          <w:p>
-            <w:r>
+            <w:tcW w:w="2232" w:type="dxa"/>
+          </w:tcPr>
+          <w:p>
+            <w:r>
+              <w:rPr>
+                <w:sz w:val="16"/>
+              </w:rPr>
+              <w:t>Персональный план тренировок</w:t>
+            </w:r>
+          </w:p>
+        </w:tc>
+        <w:tc>
+          <w:tcPr>
+            <w:tcW w:w="792" w:type="dxa"/>
+          </w:tcPr>
+          <w:p>
+            <w:r>
+              <w:rPr>
+                <w:sz w:val="16"/>
+              </w:rPr>
               <w:t>8</w:t>
             </w:r>
           </w:p>
         </w:tc>
         <w:tc>
           <w:tcPr>
-            <w:tcW w:w="1300" w:type="dxa"/>
-          </w:tcPr>
-          <w:p>
-            <w:r>
+            <w:tcW w:w="1080" w:type="dxa"/>
+          </w:tcPr>
+          <w:p>
+            <w:r>
+              <w:rPr>
+                <w:sz w:val="16"/>
+              </w:rPr>
               <w:t>7</w:t>
             </w:r>
           </w:p>
         </w:tc>
         <w:tc>
           <w:tcPr>
-            <w:tcW w:w="850" w:type="dxa"/>
-          </w:tcPr>
-          <w:p>
-            <w:r>
+            <w:tcW w:w="792" w:type="dxa"/>
+          </w:tcPr>
+          <w:p>
+            <w:r>
+              <w:rPr>
+                <w:sz w:val="16"/>
+              </w:rPr>
               <w:t>6</w:t>
             </w:r>
           </w:p>
         </w:tc>
         <w:tc>
           <w:tcPr>
-            <w:tcW w:w="850" w:type="dxa"/>
-          </w:tcPr>
-          <w:p>
-            <w:r>
+            <w:tcW w:w="792" w:type="dxa"/>
+          </w:tcPr>
+          <w:p>
+            <w:r>
+              <w:rPr>
+                <w:sz w:val="16"/>
+              </w:rPr>
               <w:t>336</w:t>
             </w:r>
           </w:p>
         </w:tc>
         <w:tc>
           <w:tcPr>
-            <w:tcW w:w="8500" w:type="dxa"/>
+            <w:tcW w:w="7560" w:type="dxa"/>
           </w:tcPr>
           <w:p>
             <w:pPr>
@@ -16455,9 +16543,69 @@
             </w:pPr>
             <w:r>
               <w:rPr>
+                <w:sz w:val="16"/>
+              </w:rPr>
+              <w:t>Impact</w:t>
+            </w:r>
+            <w:r>
+              <w:rPr>
+                <w:sz w:val="16"/>
                 <w:lang w:val="ru-RU"/>
               </w:rPr>
-              <w:t>Закрывает физическую активность. Персонализация сложнее справочника.</w:t>
+              <w:t>: закрывает блок физической активности и усиливает ценность приложения.</w:t>
+            </w:r>
+            <w:r>
+              <w:rPr>
+                <w:sz w:val="16"/>
+                <w:lang w:val="ru-RU"/>
+              </w:rPr>
+              <w:br/>
+            </w:r>
+            <w:r>
+              <w:rPr>
+                <w:sz w:val="16"/>
+              </w:rPr>
+              <w:t>Confidence</w:t>
+            </w:r>
+            <w:r>
+              <w:rPr>
+                <w:sz w:val="16"/>
+                <w:lang w:val="ru-RU"/>
+              </w:rPr>
+              <w:t xml:space="preserve">: функция входит в </w:t>
+            </w:r>
+            <w:r>
+              <w:rPr>
+                <w:sz w:val="16"/>
+              </w:rPr>
+              <w:t>MVP</w:t>
+            </w:r>
+            <w:r>
+              <w:rPr>
+                <w:sz w:val="16"/>
+                <w:lang w:val="ru-RU"/>
+              </w:rPr>
+              <w:t>, но требует уточнения логики персонализации.</w:t>
+            </w:r>
+            <w:r>
+              <w:rPr>
+                <w:sz w:val="16"/>
+                <w:lang w:val="ru-RU"/>
+              </w:rPr>
+              <w:br/>
+            </w:r>
+            <w:r>
+              <w:rPr>
+                <w:sz w:val="16"/>
+              </w:rPr>
+              <w:t>Ease</w:t>
+            </w:r>
+            <w:r>
+              <w:rPr>
+                <w:sz w:val="16"/>
+                <w:lang w:val="ru-RU"/>
+              </w:rPr>
+              <w:t>: сложнее справочника, так как зависит от цели и уровня подготовки пользователя.</w:t>
             </w:r>
           </w:p>
         </w:tc>
@@ -16468,27 +16616,42 @@
         </w:trPr>
         <w:tc>
           <w:tcPr>
-            <w:tcW w:w="3100" w:type="dxa"/>
+            <w:tcW w:w="2232" w:type="dxa"/>
           </w:tcPr>
           <w:p>
             <w:proofErr w:type="spellStart"/>
             <w:r>
+              <w:rPr>
+                <w:sz w:val="16"/>
+              </w:rPr>
               <w:t>Меню</w:t>
             </w:r>
             <w:proofErr w:type="spellEnd"/>
             <w:r>
+              <w:rPr>
+                <w:sz w:val="16"/>
+              </w:rPr>
               <w:t xml:space="preserve"> / </w:t>
             </w:r>
             <w:proofErr w:type="spellStart"/>
             <w:r>
+              <w:rPr>
+                <w:sz w:val="16"/>
+              </w:rPr>
               <w:t>список</w:t>
             </w:r>
             <w:proofErr w:type="spellEnd"/>
             <w:r>
+              <w:rPr>
+                <w:sz w:val="16"/>
+              </w:rPr>
               <w:t xml:space="preserve"> </w:t>
             </w:r>
             <w:proofErr w:type="spellStart"/>
             <w:r>
+              <w:rPr>
+                <w:sz w:val="16"/>
+              </w:rPr>
               <w:t>блюд</w:t>
             </w:r>
             <w:proofErr w:type="spellEnd"/>
@@ -16496,47 +16659,59 @@
         </w:tc>
         <w:tc>
           <w:tcPr>
-            <w:tcW w:w="900" w:type="dxa"/>
-          </w:tcPr>
-          <w:p>
-            <w:r>
+            <w:tcW w:w="792" w:type="dxa"/>
+          </w:tcPr>
+          <w:p>
+            <w:r>
+              <w:rPr>
+                <w:sz w:val="16"/>
+              </w:rPr>
               <w:t>7</w:t>
             </w:r>
           </w:p>
         </w:tc>
         <w:tc>
           <w:tcPr>
-            <w:tcW w:w="1300" w:type="dxa"/>
-          </w:tcPr>
-          <w:p>
-            <w:r>
+            <w:tcW w:w="1080" w:type="dxa"/>
+          </w:tcPr>
+          <w:p>
+            <w:r>
+              <w:rPr>
+                <w:sz w:val="16"/>
+              </w:rPr>
               <w:t>7</w:t>
             </w:r>
           </w:p>
         </w:tc>
         <w:tc>
           <w:tcPr>
-            <w:tcW w:w="850" w:type="dxa"/>
-          </w:tcPr>
-          <w:p>
-            <w:r>
+            <w:tcW w:w="792" w:type="dxa"/>
+          </w:tcPr>
+          <w:p>
+            <w:r>
+              <w:rPr>
+                <w:sz w:val="16"/>
+              </w:rPr>
               <w:t>6</w:t>
             </w:r>
           </w:p>
         </w:tc>
         <w:tc>
           <w:tcPr>
-            <w:tcW w:w="850" w:type="dxa"/>
-          </w:tcPr>
-          <w:p>
-            <w:r>
+            <w:tcW w:w="792" w:type="dxa"/>
+          </w:tcPr>
+          <w:p>
+            <w:r>
+              <w:rPr>
+                <w:sz w:val="16"/>
+              </w:rPr>
               <w:t>294</w:t>
             </w:r>
           </w:p>
         </w:tc>
         <w:tc>
           <w:tcPr>
-            <w:tcW w:w="8500" w:type="dxa"/>
+            <w:tcW w:w="7560" w:type="dxa"/>
           </w:tcPr>
           <w:p>
             <w:pPr>
@@ -16546,18 +16721,69 @@
             </w:pPr>
             <w:r>
               <w:rPr>
+                <w:sz w:val="16"/>
+              </w:rPr>
+              <w:t>Impact</w:t>
+            </w:r>
+            <w:r>
+              <w:rPr>
+                <w:sz w:val="16"/>
                 <w:lang w:val="ru-RU"/>
               </w:rPr>
-              <w:t xml:space="preserve">Упрощает выбор еды, но не является обязательным ядром </w:t>
-            </w:r>
-            <w:r>
+              <w:t xml:space="preserve">: помогает пользователю выбирать питание, но не является ядром </w:t>
+            </w:r>
+            <w:r>
+              <w:rPr>
+                <w:sz w:val="16"/>
+              </w:rPr>
               <w:t>MVP</w:t>
             </w:r>
             <w:r>
               <w:rPr>
+                <w:sz w:val="16"/>
                 <w:lang w:val="ru-RU"/>
               </w:rPr>
               <w:t>.</w:t>
+            </w:r>
+            <w:r>
+              <w:rPr>
+                <w:sz w:val="16"/>
+                <w:lang w:val="ru-RU"/>
+              </w:rPr>
+              <w:br/>
+            </w:r>
+            <w:r>
+              <w:rPr>
+                <w:sz w:val="16"/>
+              </w:rPr>
+              <w:t>Confidence</w:t>
+            </w:r>
+            <w:r>
+              <w:rPr>
+                <w:sz w:val="16"/>
+                <w:lang w:val="ru-RU"/>
+              </w:rPr>
+              <w:t>: функция связана с планом питания и подтверждается требованиями.</w:t>
+            </w:r>
+            <w:r>
+              <w:rPr>
+                <w:sz w:val="16"/>
+                <w:lang w:val="ru-RU"/>
+              </w:rPr>
+              <w:br/>
+            </w:r>
+            <w:r>
+              <w:rPr>
+                <w:sz w:val="16"/>
+              </w:rPr>
+              <w:t>Ease</w:t>
+            </w:r>
+            <w:r>
+              <w:rPr>
+                <w:sz w:val="16"/>
+                <w:lang w:val="ru-RU"/>
+              </w:rPr>
+              <w:t>: нужны структура блюд, описания и калорийность.</w:t>
             </w:r>
           </w:p>
         </w:tc>
@@ -16568,57 +16794,88 @@
         </w:trPr>
         <w:tc>
           <w:tcPr>
-            <w:tcW w:w="3100" w:type="dxa"/>
-          </w:tcPr>
-          <w:p>
-            <w:r>
-              <w:t>Калькулятор воды</w:t>
-            </w:r>
-          </w:p>
-        </w:tc>
-        <w:tc>
-          <w:tcPr>
-            <w:tcW w:w="900" w:type="dxa"/>
-          </w:tcPr>
-          <w:p>
-            <w:r>
+            <w:tcW w:w="2232" w:type="dxa"/>
+          </w:tcPr>
+          <w:p>
+            <w:proofErr w:type="spellStart"/>
+            <w:r>
+              <w:rPr>
+                <w:sz w:val="16"/>
+              </w:rPr>
+              <w:t>Калькулятор</w:t>
+            </w:r>
+            <w:proofErr w:type="spellEnd"/>
+            <w:r>
+              <w:rPr>
+                <w:sz w:val="16"/>
+              </w:rPr>
+              <w:t xml:space="preserve"> </w:t>
+            </w:r>
+            <w:proofErr w:type="spellStart"/>
+            <w:r>
+              <w:rPr>
+                <w:sz w:val="16"/>
+              </w:rPr>
+              <w:t>воды</w:t>
+            </w:r>
+            <w:proofErr w:type="spellEnd"/>
+          </w:p>
+        </w:tc>
+        <w:tc>
+          <w:tcPr>
+            <w:tcW w:w="792" w:type="dxa"/>
+          </w:tcPr>
+          <w:p>
+            <w:r>
+              <w:rPr>
+                <w:sz w:val="16"/>
+              </w:rPr>
               <w:t>5</w:t>
             </w:r>
           </w:p>
         </w:tc>
         <w:tc>
           <w:tcPr>
-            <w:tcW w:w="1300" w:type="dxa"/>
-          </w:tcPr>
-          <w:p>
-            <w:r>
+            <w:tcW w:w="1080" w:type="dxa"/>
+          </w:tcPr>
+          <w:p>
+            <w:r>
+              <w:rPr>
+                <w:sz w:val="16"/>
+              </w:rPr>
               <w:t>6</w:t>
             </w:r>
           </w:p>
         </w:tc>
         <w:tc>
           <w:tcPr>
-            <w:tcW w:w="850" w:type="dxa"/>
-          </w:tcPr>
-          <w:p>
-            <w:r>
+            <w:tcW w:w="792" w:type="dxa"/>
+          </w:tcPr>
+          <w:p>
+            <w:r>
+              <w:rPr>
+                <w:sz w:val="16"/>
+              </w:rPr>
               <w:t>8</w:t>
             </w:r>
           </w:p>
         </w:tc>
         <w:tc>
           <w:tcPr>
-            <w:tcW w:w="850" w:type="dxa"/>
-          </w:tcPr>
-          <w:p>
-            <w:r>
+            <w:tcW w:w="792" w:type="dxa"/>
+          </w:tcPr>
+          <w:p>
+            <w:r>
+              <w:rPr>
+                <w:sz w:val="16"/>
+              </w:rPr>
               <w:t>240</w:t>
             </w:r>
           </w:p>
         </w:tc>
         <w:tc>
           <w:tcPr>
-            <w:tcW w:w="8500" w:type="dxa"/>
+            <w:tcW w:w="7560" w:type="dxa"/>
           </w:tcPr>
           <w:p>
             <w:pPr>
@@ -16628,9 +16885,56 @@
             </w:pPr>
             <w:r>
               <w:rPr>
+                <w:sz w:val="16"/>
+              </w:rPr>
+              <w:t>Impact</w:t>
+            </w:r>
+            <w:r>
+              <w:rPr>
+                <w:sz w:val="16"/>
                 <w:lang w:val="ru-RU"/>
               </w:rPr>
-              <w:t>Реализуется проще, но влияние на основную цель ниже.</w:t>
+              <w:t>: полезная дополнительная функция, но влияние на основную цель ниже, чем у калорий и питания.</w:t>
+            </w:r>
+            <w:r>
+              <w:rPr>
+                <w:sz w:val="16"/>
+                <w:lang w:val="ru-RU"/>
+              </w:rPr>
+              <w:br/>
+            </w:r>
+            <w:r>
+              <w:rPr>
+                <w:sz w:val="16"/>
+              </w:rPr>
+              <w:t>Confidence</w:t>
+            </w:r>
+            <w:r>
+              <w:rPr>
+                <w:sz w:val="16"/>
+                <w:lang w:val="ru-RU"/>
+              </w:rPr>
+              <w:t>: функция добавлена позже и имеет отдельную оценку трудоемкости.</w:t>
+            </w:r>
+            <w:r>
+              <w:rPr>
+                <w:sz w:val="16"/>
+                <w:lang w:val="ru-RU"/>
+              </w:rPr>
+              <w:br/>
+            </w:r>
+            <w:r>
+              <w:rPr>
+                <w:sz w:val="16"/>
+              </w:rPr>
+              <w:t>Ease</w:t>
+            </w:r>
+            <w:r>
+              <w:rPr>
+                <w:sz w:val="16"/>
+                <w:lang w:val="ru-RU"/>
+              </w:rPr>
+              <w:t>: объем работ понятен: 160 часов; логика проще персонального плана.</w:t>
             </w:r>
           </w:p>
         </w:tc>
@@ -19674,25 +19978,7 @@
       <w:rPr>
         <w:lang w:val="ru-RU"/>
       </w:rPr>
-      <w:t xml:space="preserve">Задания 2-3. Требования, </w:t>
-    </w:r>
-    <w:r>
-      <w:t>Roadmap</w:t>
-    </w:r>
-    <w:r>
-      <w:rPr>
-        <w:lang w:val="ru-RU"/>
-      </w:rPr>
-      <w:t xml:space="preserve">, </w:t>
-    </w:r>
-    <w:r>
-      <w:t>backlog</w:t>
-    </w:r>
-    <w:r>
-      <w:rPr>
-        <w:lang w:val="ru-RU"/>
-      </w:rPr>
-      <w:t xml:space="preserve"> и приоритизация | Проект «ЗОЖ»</w:t>
+      <w:t>Задание 3. Методы расстановки приоритетов | Проект «ЗОЖ»</w:t>
     </w:r>
   </w:p>
 </w:ftr>
@@ -19917,31 +20203,31 @@
       </w:rPr>
     </w:lvl>
   </w:abstractNum>
-  <w:num w:numId="1" w16cid:durableId="2072269211">
+  <w:num w:numId="1" w16cid:durableId="1564834489">
     <w:abstractNumId w:val="8"/>
   </w:num>
-  <w:num w:numId="2" w16cid:durableId="423839094">
+  <w:num w:numId="2" w16cid:durableId="1063795425">
     <w:abstractNumId w:val="6"/>
   </w:num>
-  <w:num w:numId="3" w16cid:durableId="1069306177">
+  <w:num w:numId="3" w16cid:durableId="167868760">
     <w:abstractNumId w:val="5"/>
   </w:num>
-  <w:num w:numId="4" w16cid:durableId="1789810970">
+  <w:num w:numId="4" w16cid:durableId="1979216299">
     <w:abstractNumId w:val="4"/>
   </w:num>
-  <w:num w:numId="5" w16cid:durableId="1736733123">
+  <w:num w:numId="5" w16cid:durableId="616835851">
     <w:abstractNumId w:val="7"/>
   </w:num>
-  <w:num w:numId="6" w16cid:durableId="1626889058">
+  <w:num w:numId="6" w16cid:durableId="595480708">
     <w:abstractNumId w:val="3"/>
   </w:num>
-  <w:num w:numId="7" w16cid:durableId="165024376">
+  <w:num w:numId="7" w16cid:durableId="178394633">
     <w:abstractNumId w:val="2"/>
   </w:num>
-  <w:num w:numId="8" w16cid:durableId="1660108099">
+  <w:num w:numId="8" w16cid:durableId="617370216">
     <w:abstractNumId w:val="1"/>
   </w:num>
-  <w:num w:numId="9" w16cid:durableId="434911336">
+  <w:num w:numId="9" w16cid:durableId="1535771194">
     <w:abstractNumId w:val="0"/>
   </w:num>
 </w:numbering>
@@ -31335,22 +31621,10 @@
     <w:basedOn w:val="DefaultParagraphFont"/>
     <w:uiPriority w:val="99"/>
     <w:unhideWhenUsed/>
-    <w:rsid w:val="00CA4A3F"/>
+    <w:rsid w:val="00B55926"/>
     <w:rPr>
       <w:color w:val="0000FF" w:themeColor="hyperlink"/>
       <w:u w:val="single"/>
-    </w:rPr>
-  </w:style>
-  <w:style w:type="character" w:styleId="UnresolvedMention">
-    <w:name w:val="Unresolved Mention"/>
-    <w:basedOn w:val="DefaultParagraphFont"/>
-    <w:uiPriority w:val="99"/>
-    <w:semiHidden/>
-    <w:unhideWhenUsed/>
-    <w:rsid w:val="00CA4A3F"/>
-    <w:rPr>
-      <w:color w:val="605E5C"/>
-      <w:shd w:val="clear" w:color="auto" w:fill="E1DFDD"/>
     </w:rPr>
   </w:style>
 </w:styles>

</xml_diff>